<commit_message>
First Frontend code commit
</commit_message>
<xml_diff>
--- a/CSMS Documentation/CSMS concept and proposal.docx
+++ b/CSMS Documentation/CSMS concept and proposal.docx
@@ -1183,15 +1183,7 @@
           <w:szCs w:val="28"/>
           <w:lang w:val="en-US"/>
         </w:rPr>
-        <w:t xml:space="preserve"> </w:t>
-      </w:r>
-      <w:r>
-        <w:rPr>
-          <w:sz w:val="28"/>
-          <w:szCs w:val="28"/>
-          <w:lang w:val="en-US"/>
-        </w:rPr>
-        <w:t>to optimise labour deployment and enhance on-site safety compliance.</w:t>
+        <w:t xml:space="preserve"> to optimise labour deployment and enhance on-site safety compliance.</w:t>
       </w:r>
     </w:p>
     <w:p>
@@ -1217,6 +1209,31 @@
           <w:szCs w:val="28"/>
           <w:lang w:val="en-US"/>
         </w:rPr>
+        <w:t xml:space="preserve"> To provide an integrated data environment where disparate hardware (BLE, Biometrics, GPS, and IP Cameras) feed into a centralized LangGraph-powered reasoning engine.</w:t>
+      </w:r>
+    </w:p>
+    <w:p>
+      <w:pPr>
+        <w:rPr>
+          <w:sz w:val="28"/>
+          <w:szCs w:val="28"/>
+          <w:lang w:val="en-US"/>
+        </w:rPr>
+      </w:pPr>
+      <w:r>
+        <w:rPr>
+          <w:sz w:val="28"/>
+          <w:szCs w:val="28"/>
+          <w:lang w:val="en-US"/>
+        </w:rPr>
+        <w:t>5.</w:t>
+      </w:r>
+      <w:r>
+        <w:rPr>
+          <w:sz w:val="28"/>
+          <w:szCs w:val="28"/>
+          <w:lang w:val="en-US"/>
+        </w:rPr>
         <w:t xml:space="preserve"> </w:t>
       </w:r>
       <w:r>
@@ -1225,39 +1242,6 @@
           <w:szCs w:val="28"/>
           <w:lang w:val="en-US"/>
         </w:rPr>
-        <w:t>To provide an integrated data environment where disparate hardware (BLE, Biometrics, GPS, and IP Cameras) feed into a centralized LangGraph-powered reasoning engine.</w:t>
-      </w:r>
-    </w:p>
-    <w:p>
-      <w:pPr>
-        <w:rPr>
-          <w:sz w:val="28"/>
-          <w:szCs w:val="28"/>
-          <w:lang w:val="en-US"/>
-        </w:rPr>
-      </w:pPr>
-      <w:r>
-        <w:rPr>
-          <w:sz w:val="28"/>
-          <w:szCs w:val="28"/>
-          <w:lang w:val="en-US"/>
-        </w:rPr>
-        <w:t>5.</w:t>
-      </w:r>
-      <w:r>
-        <w:rPr>
-          <w:sz w:val="28"/>
-          <w:szCs w:val="28"/>
-          <w:lang w:val="en-US"/>
-        </w:rPr>
-        <w:t xml:space="preserve"> </w:t>
-      </w:r>
-      <w:r>
-        <w:rPr>
-          <w:sz w:val="28"/>
-          <w:szCs w:val="28"/>
-          <w:lang w:val="en-US"/>
-        </w:rPr>
         <w:t>To track assets and feed their data analytics to the platform</w:t>
       </w:r>
     </w:p>
@@ -1292,15 +1276,7 @@
           <w:szCs w:val="28"/>
           <w:lang w:val="en-US"/>
         </w:rPr>
-        <w:t xml:space="preserve">7. </w:t>
-      </w:r>
-      <w:r>
-        <w:rPr>
-          <w:sz w:val="28"/>
-          <w:szCs w:val="28"/>
-          <w:lang w:val="en-US"/>
-        </w:rPr>
-        <w:t>To improve construction site safety by providing automated detection of PPE violations, unauthorised zone access, and after-hours security incidents.</w:t>
+        <w:t>7. To improve construction site safety by providing automated detection of PPE violations, unauthorised zone access, and after-hours security incidents.</w:t>
       </w:r>
     </w:p>
     <w:p>
@@ -2615,7 +2591,7 @@
         <mc:AlternateContent>
           <mc:Choice Requires="wps">
             <w:drawing>
-              <wp:anchor distT="0" distB="0" distL="114300" distR="114300" simplePos="0" relativeHeight="251661312" behindDoc="0" locked="0" layoutInCell="1" allowOverlap="1" wp14:anchorId="39589D34" wp14:editId="3D12302C">
+              <wp:anchor distT="0" distB="0" distL="114300" distR="114300" simplePos="0" relativeHeight="251661312" behindDoc="0" locked="0" layoutInCell="1" allowOverlap="1" wp14:anchorId="39589D34" wp14:editId="7B97DA67">
                 <wp:simplePos x="0" y="0"/>
                 <wp:positionH relativeFrom="column">
                   <wp:posOffset>5823502</wp:posOffset>
@@ -2680,7 +2656,7 @@
           </mc:Choice>
           <mc:Fallback>
             <w:pict>
-              <v:rect w14:anchorId="04A9A700" id="Rectangle 3" o:spid="_x0000_s1026" style="position:absolute;margin-left:458.55pt;margin-top:10.3pt;width:34.05pt;height:55.75pt;z-index:251661312;visibility:visible;mso-wrap-style:square;mso-width-percent:0;mso-height-percent:0;mso-wrap-distance-left:9pt;mso-wrap-distance-top:0;mso-wrap-distance-right:9pt;mso-wrap-distance-bottom:0;mso-position-horizontal:absolute;mso-position-horizontal-relative:text;mso-position-vertical:absolute;mso-position-vertical-relative:text;mso-width-percent:0;mso-height-percent:0;mso-width-relative:margin;mso-height-relative:margin;v-text-anchor:middle" o:gfxdata="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" fillcolor="white [3201]" strokecolor="black [3213]" strokeweight="1pt"/>
+              <v:rect w14:anchorId="4AD0C267" id="Rectangle 3" o:spid="_x0000_s1026" style="position:absolute;margin-left:458.55pt;margin-top:10.3pt;width:34.05pt;height:55.75pt;z-index:251661312;visibility:visible;mso-wrap-style:square;mso-width-percent:0;mso-height-percent:0;mso-wrap-distance-left:9pt;mso-wrap-distance-top:0;mso-wrap-distance-right:9pt;mso-wrap-distance-bottom:0;mso-position-horizontal:absolute;mso-position-horizontal-relative:text;mso-position-vertical:absolute;mso-position-vertical-relative:text;mso-width-percent:0;mso-height-percent:0;mso-width-relative:margin;mso-height-relative:margin;v-text-anchor:middle" o:gfxdata="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" fillcolor="white [3201]" strokecolor="black [3213]" strokeweight="1pt"/>
             </w:pict>
           </mc:Fallback>
         </mc:AlternateContent>
@@ -2695,7 +2671,7 @@
         <mc:AlternateContent>
           <mc:Choice Requires="wps">
             <w:drawing>
-              <wp:anchor distT="0" distB="0" distL="114300" distR="114300" simplePos="0" relativeHeight="251679744" behindDoc="0" locked="0" layoutInCell="1" allowOverlap="1" wp14:anchorId="28B6AC46" wp14:editId="7521F5C9">
+              <wp:anchor distT="0" distB="0" distL="114300" distR="114300" simplePos="0" relativeHeight="251679744" behindDoc="0" locked="0" layoutInCell="1" allowOverlap="1" wp14:anchorId="28B6AC46" wp14:editId="284D2669">
                 <wp:simplePos x="0" y="0"/>
                 <wp:positionH relativeFrom="column">
                   <wp:posOffset>1150375</wp:posOffset>
@@ -2750,13 +2726,22 @@
           </mc:Choice>
           <mc:Fallback>
             <w:pict>
-              <v:line w14:anchorId="172FB363" id="Straight Connector 15" o:spid="_x0000_s1026" style="position:absolute;z-index:251679744;visibility:visible;mso-wrap-style:square;mso-width-percent:0;mso-height-percent:0;mso-wrap-distance-left:9pt;mso-wrap-distance-top:0;mso-wrap-distance-right:9pt;mso-wrap-distance-bottom:0;mso-position-horizontal:absolute;mso-position-horizontal-relative:text;mso-position-vertical:absolute;mso-position-vertical-relative:text;mso-width-percent:0;mso-height-percent:0;mso-width-relative:margin;mso-height-relative:margin" from="90.6pt,13.55pt" to="194.3pt,29pt" o:gfxdata="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" strokecolor="black [3200]" strokeweight=".5pt">
+              <v:line w14:anchorId="61E8BABE" id="Straight Connector 15" o:spid="_x0000_s1026" style="position:absolute;z-index:251679744;visibility:visible;mso-wrap-style:square;mso-width-percent:0;mso-height-percent:0;mso-wrap-distance-left:9pt;mso-wrap-distance-top:0;mso-wrap-distance-right:9pt;mso-wrap-distance-bottom:0;mso-position-horizontal:absolute;mso-position-horizontal-relative:text;mso-position-vertical:absolute;mso-position-vertical-relative:text;mso-width-percent:0;mso-height-percent:0;mso-width-relative:margin;mso-height-relative:margin" from="90.6pt,13.55pt" to="194.3pt,29pt" o:gfxdata="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" strokecolor="black [3200]" strokeweight=".5pt">
                 <v:stroke joinstyle="miter"/>
               </v:line>
             </w:pict>
           </mc:Fallback>
         </mc:AlternateContent>
       </w:r>
+    </w:p>
+    <w:p>
+      <w:pPr>
+        <w:rPr>
+          <w:b/>
+          <w:bCs/>
+          <w:lang w:val="en-US"/>
+        </w:rPr>
+      </w:pPr>
       <w:r>
         <w:rPr>
           <w:noProof/>
@@ -2767,15 +2752,15 @@
         <mc:AlternateContent>
           <mc:Choice Requires="wps">
             <w:drawing>
-              <wp:anchor distT="0" distB="0" distL="114300" distR="114300" simplePos="0" relativeHeight="251673600" behindDoc="0" locked="0" layoutInCell="1" allowOverlap="1" wp14:anchorId="4D463CE0" wp14:editId="38714488">
+              <wp:anchor distT="0" distB="0" distL="114300" distR="114300" simplePos="0" relativeHeight="251673600" behindDoc="0" locked="0" layoutInCell="1" allowOverlap="1" wp14:anchorId="4D463CE0" wp14:editId="5D829331">
                 <wp:simplePos x="0" y="0"/>
                 <wp:positionH relativeFrom="column">
-                  <wp:posOffset>2585720</wp:posOffset>
+                  <wp:posOffset>2586521</wp:posOffset>
                 </wp:positionH>
                 <wp:positionV relativeFrom="paragraph">
-                  <wp:posOffset>92075</wp:posOffset>
+                  <wp:posOffset>6323</wp:posOffset>
                 </wp:positionV>
-                <wp:extent cx="687971" cy="383458"/>
+                <wp:extent cx="687705" cy="382905"/>
                 <wp:effectExtent l="0" t="0" r="0" b="0"/>
                 <wp:wrapNone/>
                 <wp:docPr id="11" name="Text Box 11"/>
@@ -2787,7 +2772,7 @@
                       <wps:spPr>
                         <a:xfrm>
                           <a:off x="0" y="0"/>
-                          <a:ext cx="687971" cy="383458"/>
+                          <a:ext cx="687705" cy="382905"/>
                         </a:xfrm>
                         <a:prstGeom prst="rect">
                           <a:avLst/>
@@ -2817,7 +2802,7 @@
                                 <w:szCs w:val="12"/>
                                 <w:lang w:val="en-US"/>
                               </w:rPr>
-                              <w:t xml:space="preserve">GPU powered on-site processing </w:t>
+                              <w:t xml:space="preserve"> on-site processing </w:t>
                             </w:r>
                           </w:p>
                         </w:txbxContent>
@@ -2842,7 +2827,11 @@
           </mc:Choice>
           <mc:Fallback>
             <w:pict>
-              <v:shape w14:anchorId="4D463CE0" id="Text Box 11" o:spid="_x0000_s1030" type="#_x0000_t202" style="position:absolute;margin-left:203.6pt;margin-top:7.25pt;width:54.15pt;height:30.2pt;z-index:251673600;visibility:visible;mso-wrap-style:square;mso-width-percent:0;mso-height-percent:0;mso-wrap-distance-left:9pt;mso-wrap-distance-top:0;mso-wrap-distance-right:9pt;mso-wrap-distance-bottom:0;mso-position-horizontal:absolute;mso-position-horizontal-relative:text;mso-position-vertical:absolute;mso-position-vertical-relative:text;mso-width-percent:0;mso-height-percent:0;mso-width-relative:margin;mso-height-relative:margin;v-text-anchor:top" o:gfxdata="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" fillcolor="white [3201]" stroked="f" strokeweight=".5pt">
+              <v:shapetype w14:anchorId="4D463CE0" id="_x0000_t202" coordsize="21600,21600" o:spt="202" path="m,l,21600r21600,l21600,xe">
+                <v:stroke joinstyle="miter"/>
+                <v:path gradientshapeok="t" o:connecttype="rect"/>
+              </v:shapetype>
+              <v:shape id="Text Box 11" o:spid="_x0000_s1030" type="#_x0000_t202" style="position:absolute;margin-left:203.65pt;margin-top:.5pt;width:54.15pt;height:30.15pt;z-index:251673600;visibility:visible;mso-wrap-style:square;mso-width-percent:0;mso-height-percent:0;mso-wrap-distance-left:9pt;mso-wrap-distance-top:0;mso-wrap-distance-right:9pt;mso-wrap-distance-bottom:0;mso-position-horizontal:absolute;mso-position-horizontal-relative:text;mso-position-vertical:absolute;mso-position-vertical-relative:text;mso-width-percent:0;mso-height-percent:0;mso-width-relative:margin;mso-height-relative:margin;v-text-anchor:top" o:gfxdata="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" fillcolor="white [3201]" stroked="f" strokeweight=".5pt">
                 <v:textbox>
                   <w:txbxContent>
                     <w:p>
@@ -2861,7 +2850,7 @@
                           <w:szCs w:val="12"/>
                           <w:lang w:val="en-US"/>
                         </w:rPr>
-                        <w:t xml:space="preserve">GPU powered on-site processing </w:t>
+                        <w:t xml:space="preserve"> on-site processing </w:t>
                       </w:r>
                     </w:p>
                   </w:txbxContent>
@@ -2871,15 +2860,6 @@
           </mc:Fallback>
         </mc:AlternateContent>
       </w:r>
-    </w:p>
-    <w:p>
-      <w:pPr>
-        <w:rPr>
-          <w:b/>
-          <w:bCs/>
-          <w:lang w:val="en-US"/>
-        </w:rPr>
-      </w:pPr>
       <w:r>
         <w:rPr>
           <w:b/>

</xml_diff>